<commit_message>
Describe real-world evidence without naming where it came from
Comments, docstrings and AGENTS.md named the private templates that
measurements were taken from: their owners, template names, and merge
tags copied from them. Each now describes the document's shape instead,
keeping the measurement, the spec citation and the fixture it rests on.

autofit-columns.docx and table-widths.docx held a template's merge
tags. They now hold tags with the same character counts and, in
Calibri, the same width to within 7/2048 em, so the Word measurements
recorded for them still hold. The tests count characters in DxNoGap
and are unchanged. A segmentation unit test now uses a neutral tag of
the same shape.

Co-Authored-By: Claude Opus 5.5 (1M context) <noreply@anthropic.com>
</commit_message>
<xml_diff>
--- a/test-files/autofit-columns.docx
+++ b/test-files/autofit-columns.docx
@@ -40,7 +40,7 @@
           </w:p>
           <w:p>
             <w:r>
-              <w:t xml:space="preserve">{#donations}{Donor}</w:t>
+              <w:t xml:space="preserve">{#customers}{Buyer}</w:t>
             </w:r>
           </w:p>
         </w:tc>
@@ -159,7 +159,7 @@
           </w:p>
           <w:p>
             <w:r>
-              <w:t xml:space="preserve">{#donations}{Donor}</w:t>
+              <w:t xml:space="preserve">{#customers}{Buyer}</w:t>
             </w:r>
           </w:p>
         </w:tc>
@@ -234,7 +234,7 @@
           </w:p>
           <w:p>
             <w:r>
-              <w:t xml:space="preserve">{#donations}{Donor}</w:t>
+              <w:t xml:space="preserve">{#customers}{Buyer}</w:t>
             </w:r>
           </w:p>
         </w:tc>
@@ -397,7 +397,7 @@
           </w:p>
           <w:p>
             <w:r>
-              <w:t xml:space="preserve">Donor name and address</w:t>
+              <w:t xml:space="preserve">Rebuy name and address</w:t>
             </w:r>
           </w:p>
         </w:tc>
@@ -516,7 +516,7 @@
           </w:p>
           <w:p>
             <w:r>
-              <w:t xml:space="preserve">{#donations}{Donor}</w:t>
+              <w:t xml:space="preserve">{#customers}{Buyer}</w:t>
             </w:r>
           </w:p>
         </w:tc>
@@ -635,7 +635,7 @@
           </w:p>
           <w:p>
             <w:r>
-              <w:t xml:space="preserve">{#donations}{Donor}</w:t>
+              <w:t xml:space="preserve">{#customers}{Buyer}</w:t>
             </w:r>
           </w:p>
         </w:tc>

</xml_diff>